<commit_message>
feat: Introduce Diploma model and context summary in CV schema, enhancing CV data extraction and representation
</commit_message>
<xml_diff>
--- a/CV2DOC-n8n-flow-main/cv2doc/src/cv2doc/json2doc/template.docx
+++ b/CV2DOC-n8n-flow-main/cv2doc/src/cv2doc/json2doc/template.docx
@@ -1487,11 +1487,19 @@
                                 <w:rFonts w:ascii="GT Eesti Pro Display Light" w:hAnsi="GT Eesti Pro Display Light"/>
                               </w:rPr>
                             </w:pPr>
+                            <w:proofErr w:type="gramStart"/>
                             <w:r>
                               <w:rPr>
                                 <w:rFonts w:ascii="GT Eesti Pro Display Light" w:hAnsi="GT Eesti Pro Display Light"/>
                               </w:rPr>
-                              <w:t>…</w:t>
+                              <w:t>{{ contexte</w:t>
+                            </w:r>
+                            <w:proofErr w:type="gramEnd"/>
+                            <w:r>
+                              <w:rPr>
+                                <w:rFonts w:ascii="GT Eesti Pro Display Light" w:hAnsi="GT Eesti Pro Display Light"/>
+                              </w:rPr>
+                              <w:t xml:space="preserve"> }}</w:t>
                             </w:r>
                           </w:p>
                         </w:txbxContent>
@@ -1516,7 +1524,11 @@
           </mc:Choice>
           <mc:Fallback>
             <w:pict>
-              <v:shape w14:anchorId="633B3700" id="Zone de texte 4" o:spid="_x0000_s1030" type="#_x0000_t202" style="position:absolute;margin-left:19.75pt;margin-top:32.6pt;width:409.45pt;height:76.8pt;z-index:251676672;visibility:visible;mso-wrap-style:square;mso-width-percent:0;mso-height-percent:0;mso-wrap-distance-left:9pt;mso-wrap-distance-top:0;mso-wrap-distance-right:9pt;mso-wrap-distance-bottom:0;mso-position-horizontal:absolute;mso-position-horizontal-relative:margin;mso-position-vertical:absolute;mso-position-vertical-relative:text;mso-width-percent:0;mso-height-percent:0;mso-width-relative:margin;mso-height-relative:margin;v-text-anchor:top" o:gfxdata="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" filled="f" stroked="f" strokeweight=".5pt">
+              <v:shapetype w14:anchorId="633B3700" id="_x0000_t202" coordsize="21600,21600" o:spt="202" path="m,l,21600r21600,l21600,xe">
+                <v:stroke joinstyle="miter"/>
+                <v:path gradientshapeok="t" o:connecttype="rect"/>
+              </v:shapetype>
+              <v:shape id="Zone de texte 4" o:spid="_x0000_s1030" type="#_x0000_t202" style="position:absolute;margin-left:19.75pt;margin-top:32.6pt;width:409.45pt;height:76.8pt;z-index:251676672;visibility:visible;mso-wrap-style:square;mso-width-percent:0;mso-height-percent:0;mso-wrap-distance-left:9pt;mso-wrap-distance-top:0;mso-wrap-distance-right:9pt;mso-wrap-distance-bottom:0;mso-position-horizontal:absolute;mso-position-horizontal-relative:margin;mso-position-vertical:absolute;mso-position-vertical-relative:text;mso-width-percent:0;mso-height-percent:0;mso-width-relative:margin;mso-height-relative:margin;v-text-anchor:top" o:gfxdata="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" filled="f" stroked="f" strokeweight=".5pt">
                 <v:textbox>
                   <w:txbxContent>
                     <w:p>
@@ -1526,11 +1538,19 @@
                           <w:rFonts w:ascii="GT Eesti Pro Display Light" w:hAnsi="GT Eesti Pro Display Light"/>
                         </w:rPr>
                       </w:pPr>
+                      <w:proofErr w:type="gramStart"/>
                       <w:r>
                         <w:rPr>
                           <w:rFonts w:ascii="GT Eesti Pro Display Light" w:hAnsi="GT Eesti Pro Display Light"/>
                         </w:rPr>
-                        <w:t>…</w:t>
+                        <w:t>{{ contexte</w:t>
+                      </w:r>
+                      <w:proofErr w:type="gramEnd"/>
+                      <w:r>
+                        <w:rPr>
+                          <w:rFonts w:ascii="GT Eesti Pro Display Light" w:hAnsi="GT Eesti Pro Display Light"/>
+                        </w:rPr>
+                        <w:t xml:space="preserve"> }}</w:t>
                       </w:r>
                     </w:p>
                   </w:txbxContent>
@@ -1599,7 +1619,7 @@
         <mc:AlternateContent>
           <mc:Choice Requires="wps">
             <w:drawing>
-              <wp:anchor distT="0" distB="0" distL="114300" distR="114300" simplePos="0" relativeHeight="251683840" behindDoc="0" locked="0" layoutInCell="1" allowOverlap="1" wp14:anchorId="64397061" wp14:editId="10B84F77">
+              <wp:anchor distT="0" distB="0" distL="114300" distR="114300" simplePos="0" relativeHeight="251683840" behindDoc="0" locked="0" layoutInCell="1" allowOverlap="1" wp14:anchorId="64397061" wp14:editId="1F110749">
                 <wp:simplePos x="0" y="0"/>
                 <wp:positionH relativeFrom="column">
                   <wp:posOffset>2883640</wp:posOffset>
@@ -1669,7 +1689,6 @@
                                 <w:color w:val="FFFFFF" w:themeColor="background1"/>
                                 <w:sz w:val="20"/>
                                 <w:szCs w:val="20"/>
-                                <w:u w:val="single"/>
                                 <w14:textOutline w14:w="9525" w14:cap="rnd" w14:cmpd="sng" w14:algn="ctr">
                                   <w14:noFill/>
                                   <w14:prstDash w14:val="solid"/>
@@ -1683,7 +1702,6 @@
                                 <w:color w:val="FFFFFF" w:themeColor="background1"/>
                                 <w:sz w:val="20"/>
                                 <w:szCs w:val="20"/>
-                                <w:u w:val="single"/>
                                 <w14:textOutline w14:w="9525" w14:cap="rnd" w14:cmpd="sng" w14:algn="ctr">
                                   <w14:noFill/>
                                   <w14:prstDash w14:val="solid"/>
@@ -1698,7 +1716,6 @@
                                 <w:color w:val="FFFFFF" w:themeColor="background1"/>
                                 <w:sz w:val="20"/>
                                 <w:szCs w:val="20"/>
-                                <w:u w:val="single"/>
                                 <w14:textOutline w14:w="9525" w14:cap="rnd" w14:cmpd="sng" w14:algn="ctr">
                                   <w14:noFill/>
                                   <w14:prstDash w14:val="solid"/>
@@ -1713,7 +1730,6 @@
                                 <w:color w:val="FFFFFF" w:themeColor="background1"/>
                                 <w:sz w:val="20"/>
                                 <w:szCs w:val="20"/>
-                                <w:u w:val="single"/>
                                 <w14:textOutline w14:w="9525" w14:cap="rnd" w14:cmpd="sng" w14:algn="ctr">
                                   <w14:noFill/>
                                   <w14:prstDash w14:val="solid"/>
@@ -1729,7 +1745,6 @@
                                 <w:color w:val="FFFFFF" w:themeColor="background1"/>
                                 <w:sz w:val="20"/>
                                 <w:szCs w:val="20"/>
-                                <w:u w:val="single"/>
                                 <w14:textOutline w14:w="9525" w14:cap="rnd" w14:cmpd="sng" w14:algn="ctr">
                                   <w14:noFill/>
                                   <w14:prstDash w14:val="solid"/>
@@ -1745,7 +1760,6 @@
                                 <w:color w:val="FFFFFF" w:themeColor="background1"/>
                                 <w:sz w:val="20"/>
                                 <w:szCs w:val="20"/>
-                                <w:u w:val="single"/>
                                 <w14:textOutline w14:w="9525" w14:cap="rnd" w14:cmpd="sng" w14:algn="ctr">
                                   <w14:noFill/>
                                   <w14:prstDash w14:val="solid"/>
@@ -1763,7 +1777,6 @@
                                 <w:color w:val="FFFFFF" w:themeColor="background1"/>
                                 <w:sz w:val="20"/>
                                 <w:szCs w:val="20"/>
-                                <w:u w:val="single"/>
                                 <w14:textOutline w14:w="9525" w14:cap="rnd" w14:cmpd="sng" w14:algn="ctr">
                                   <w14:noFill/>
                                   <w14:prstDash w14:val="solid"/>
@@ -1778,7 +1791,6 @@
                                 <w:color w:val="FFFFFF" w:themeColor="background1"/>
                                 <w:sz w:val="20"/>
                                 <w:szCs w:val="20"/>
-                                <w:u w:val="single"/>
                                 <w14:textOutline w14:w="9525" w14:cap="rnd" w14:cmpd="sng" w14:algn="ctr">
                                   <w14:noFill/>
                                   <w14:prstDash w14:val="solid"/>
@@ -1794,7 +1806,6 @@
                                 <w:color w:val="FFFFFF" w:themeColor="background1"/>
                                 <w:sz w:val="20"/>
                                 <w:szCs w:val="20"/>
-                                <w:u w:val="single"/>
                                 <w14:textOutline w14:w="9525" w14:cap="rnd" w14:cmpd="sng" w14:algn="ctr">
                                   <w14:noFill/>
                                   <w14:prstDash w14:val="solid"/>
@@ -1810,7 +1821,6 @@
                                 <w:color w:val="FFFFFF" w:themeColor="background1"/>
                                 <w:sz w:val="20"/>
                                 <w:szCs w:val="20"/>
-                                <w:u w:val="single"/>
                                 <w14:textOutline w14:w="9525" w14:cap="rnd" w14:cmpd="sng" w14:algn="ctr">
                                   <w14:noFill/>
                                   <w14:prstDash w14:val="solid"/>
@@ -1826,7 +1836,6 @@
                                 <w:color w:val="FFFFFF" w:themeColor="background1"/>
                                 <w:sz w:val="20"/>
                                 <w:szCs w:val="20"/>
-                                <w:u w:val="single"/>
                                 <w14:textOutline w14:w="9525" w14:cap="rnd" w14:cmpd="sng" w14:algn="ctr">
                                   <w14:noFill/>
                                   <w14:prstDash w14:val="solid"/>
@@ -1842,7 +1851,6 @@
                                 <w:color w:val="FFFFFF" w:themeColor="background1"/>
                                 <w:sz w:val="20"/>
                                 <w:szCs w:val="20"/>
-                                <w:u w:val="single"/>
                                 <w14:textOutline w14:w="9525" w14:cap="rnd" w14:cmpd="sng" w14:algn="ctr">
                                   <w14:noFill/>
                                   <w14:prstDash w14:val="solid"/>
@@ -1858,7 +1866,6 @@
                                 <w:color w:val="FFFFFF" w:themeColor="background1"/>
                                 <w:sz w:val="20"/>
                                 <w:szCs w:val="20"/>
-                                <w:u w:val="single"/>
                                 <w14:textOutline w14:w="9525" w14:cap="rnd" w14:cmpd="sng" w14:algn="ctr">
                                   <w14:noFill/>
                                   <w14:prstDash w14:val="solid"/>
@@ -1876,7 +1883,6 @@
                                 <w:color w:val="FFFFFF" w:themeColor="background1"/>
                                 <w:sz w:val="20"/>
                                 <w:szCs w:val="20"/>
-                                <w:u w:val="single"/>
                                 <w14:textOutline w14:w="9525" w14:cap="rnd" w14:cmpd="sng" w14:algn="ctr">
                                   <w14:noFill/>
                                   <w14:prstDash w14:val="solid"/>
@@ -1890,7 +1896,6 @@
                                 <w:color w:val="FFFFFF" w:themeColor="background1"/>
                                 <w:sz w:val="20"/>
                                 <w:szCs w:val="20"/>
-                                <w:u w:val="single"/>
                                 <w14:textOutline w14:w="9525" w14:cap="rnd" w14:cmpd="sng" w14:algn="ctr">
                                   <w14:noFill/>
                                   <w14:prstDash w14:val="solid"/>
@@ -1905,7 +1910,6 @@
                                 <w:color w:val="FFFFFF" w:themeColor="background1"/>
                                 <w:sz w:val="20"/>
                                 <w:szCs w:val="20"/>
-                                <w:u w:val="single"/>
                                 <w14:textOutline w14:w="9525" w14:cap="rnd" w14:cmpd="sng" w14:algn="ctr">
                                   <w14:noFill/>
                                   <w14:prstDash w14:val="solid"/>
@@ -1920,7 +1924,6 @@
                                 <w:color w:val="FFFFFF" w:themeColor="background1"/>
                                 <w:sz w:val="20"/>
                                 <w:szCs w:val="20"/>
-                                <w:u w:val="single"/>
                                 <w14:textOutline w14:w="9525" w14:cap="rnd" w14:cmpd="sng" w14:algn="ctr">
                                   <w14:noFill/>
                                   <w14:prstDash w14:val="solid"/>
@@ -1936,7 +1939,6 @@
                                 <w:color w:val="FFFFFF" w:themeColor="background1"/>
                                 <w:sz w:val="20"/>
                                 <w:szCs w:val="20"/>
-                                <w:u w:val="single"/>
                                 <w14:textOutline w14:w="9525" w14:cap="rnd" w14:cmpd="sng" w14:algn="ctr">
                                   <w14:noFill/>
                                   <w14:prstDash w14:val="solid"/>
@@ -1952,7 +1954,6 @@
                                 <w:color w:val="FFFFFF" w:themeColor="background1"/>
                                 <w:sz w:val="20"/>
                                 <w:szCs w:val="20"/>
-                                <w:u w:val="single"/>
                                 <w14:textOutline w14:w="9525" w14:cap="rnd" w14:cmpd="sng" w14:algn="ctr">
                                   <w14:noFill/>
                                   <w14:prstDash w14:val="solid"/>
@@ -2130,7 +2131,6 @@
                           <w:color w:val="FFFFFF" w:themeColor="background1"/>
                           <w:sz w:val="20"/>
                           <w:szCs w:val="20"/>
-                          <w:u w:val="single"/>
                           <w14:textOutline w14:w="9525" w14:cap="rnd" w14:cmpd="sng" w14:algn="ctr">
                             <w14:noFill/>
                             <w14:prstDash w14:val="solid"/>
@@ -2144,7 +2144,6 @@
                           <w:color w:val="FFFFFF" w:themeColor="background1"/>
                           <w:sz w:val="20"/>
                           <w:szCs w:val="20"/>
-                          <w:u w:val="single"/>
                           <w14:textOutline w14:w="9525" w14:cap="rnd" w14:cmpd="sng" w14:algn="ctr">
                             <w14:noFill/>
                             <w14:prstDash w14:val="solid"/>
@@ -2159,7 +2158,6 @@
                           <w:color w:val="FFFFFF" w:themeColor="background1"/>
                           <w:sz w:val="20"/>
                           <w:szCs w:val="20"/>
-                          <w:u w:val="single"/>
                           <w14:textOutline w14:w="9525" w14:cap="rnd" w14:cmpd="sng" w14:algn="ctr">
                             <w14:noFill/>
                             <w14:prstDash w14:val="solid"/>
@@ -2174,7 +2172,6 @@
                           <w:color w:val="FFFFFF" w:themeColor="background1"/>
                           <w:sz w:val="20"/>
                           <w:szCs w:val="20"/>
-                          <w:u w:val="single"/>
                           <w14:textOutline w14:w="9525" w14:cap="rnd" w14:cmpd="sng" w14:algn="ctr">
                             <w14:noFill/>
                             <w14:prstDash w14:val="solid"/>
@@ -2190,7 +2187,6 @@
                           <w:color w:val="FFFFFF" w:themeColor="background1"/>
                           <w:sz w:val="20"/>
                           <w:szCs w:val="20"/>
-                          <w:u w:val="single"/>
                           <w14:textOutline w14:w="9525" w14:cap="rnd" w14:cmpd="sng" w14:algn="ctr">
                             <w14:noFill/>
                             <w14:prstDash w14:val="solid"/>
@@ -2206,7 +2202,6 @@
                           <w:color w:val="FFFFFF" w:themeColor="background1"/>
                           <w:sz w:val="20"/>
                           <w:szCs w:val="20"/>
-                          <w:u w:val="single"/>
                           <w14:textOutline w14:w="9525" w14:cap="rnd" w14:cmpd="sng" w14:algn="ctr">
                             <w14:noFill/>
                             <w14:prstDash w14:val="solid"/>
@@ -2224,7 +2219,6 @@
                           <w:color w:val="FFFFFF" w:themeColor="background1"/>
                           <w:sz w:val="20"/>
                           <w:szCs w:val="20"/>
-                          <w:u w:val="single"/>
                           <w14:textOutline w14:w="9525" w14:cap="rnd" w14:cmpd="sng" w14:algn="ctr">
                             <w14:noFill/>
                             <w14:prstDash w14:val="solid"/>
@@ -2239,7 +2233,6 @@
                           <w:color w:val="FFFFFF" w:themeColor="background1"/>
                           <w:sz w:val="20"/>
                           <w:szCs w:val="20"/>
-                          <w:u w:val="single"/>
                           <w14:textOutline w14:w="9525" w14:cap="rnd" w14:cmpd="sng" w14:algn="ctr">
                             <w14:noFill/>
                             <w14:prstDash w14:val="solid"/>
@@ -2255,7 +2248,6 @@
                           <w:color w:val="FFFFFF" w:themeColor="background1"/>
                           <w:sz w:val="20"/>
                           <w:szCs w:val="20"/>
-                          <w:u w:val="single"/>
                           <w14:textOutline w14:w="9525" w14:cap="rnd" w14:cmpd="sng" w14:algn="ctr">
                             <w14:noFill/>
                             <w14:prstDash w14:val="solid"/>
@@ -2271,7 +2263,6 @@
                           <w:color w:val="FFFFFF" w:themeColor="background1"/>
                           <w:sz w:val="20"/>
                           <w:szCs w:val="20"/>
-                          <w:u w:val="single"/>
                           <w14:textOutline w14:w="9525" w14:cap="rnd" w14:cmpd="sng" w14:algn="ctr">
                             <w14:noFill/>
                             <w14:prstDash w14:val="solid"/>
@@ -2287,7 +2278,6 @@
                           <w:color w:val="FFFFFF" w:themeColor="background1"/>
                           <w:sz w:val="20"/>
                           <w:szCs w:val="20"/>
-                          <w:u w:val="single"/>
                           <w14:textOutline w14:w="9525" w14:cap="rnd" w14:cmpd="sng" w14:algn="ctr">
                             <w14:noFill/>
                             <w14:prstDash w14:val="solid"/>
@@ -2303,7 +2293,6 @@
                           <w:color w:val="FFFFFF" w:themeColor="background1"/>
                           <w:sz w:val="20"/>
                           <w:szCs w:val="20"/>
-                          <w:u w:val="single"/>
                           <w14:textOutline w14:w="9525" w14:cap="rnd" w14:cmpd="sng" w14:algn="ctr">
                             <w14:noFill/>
                             <w14:prstDash w14:val="solid"/>
@@ -2319,7 +2308,6 @@
                           <w:color w:val="FFFFFF" w:themeColor="background1"/>
                           <w:sz w:val="20"/>
                           <w:szCs w:val="20"/>
-                          <w:u w:val="single"/>
                           <w14:textOutline w14:w="9525" w14:cap="rnd" w14:cmpd="sng" w14:algn="ctr">
                             <w14:noFill/>
                             <w14:prstDash w14:val="solid"/>
@@ -2337,7 +2325,6 @@
                           <w:color w:val="FFFFFF" w:themeColor="background1"/>
                           <w:sz w:val="20"/>
                           <w:szCs w:val="20"/>
-                          <w:u w:val="single"/>
                           <w14:textOutline w14:w="9525" w14:cap="rnd" w14:cmpd="sng" w14:algn="ctr">
                             <w14:noFill/>
                             <w14:prstDash w14:val="solid"/>
@@ -2351,7 +2338,6 @@
                           <w:color w:val="FFFFFF" w:themeColor="background1"/>
                           <w:sz w:val="20"/>
                           <w:szCs w:val="20"/>
-                          <w:u w:val="single"/>
                           <w14:textOutline w14:w="9525" w14:cap="rnd" w14:cmpd="sng" w14:algn="ctr">
                             <w14:noFill/>
                             <w14:prstDash w14:val="solid"/>
@@ -2366,7 +2352,6 @@
                           <w:color w:val="FFFFFF" w:themeColor="background1"/>
                           <w:sz w:val="20"/>
                           <w:szCs w:val="20"/>
-                          <w:u w:val="single"/>
                           <w14:textOutline w14:w="9525" w14:cap="rnd" w14:cmpd="sng" w14:algn="ctr">
                             <w14:noFill/>
                             <w14:prstDash w14:val="solid"/>
@@ -2381,7 +2366,6 @@
                           <w:color w:val="FFFFFF" w:themeColor="background1"/>
                           <w:sz w:val="20"/>
                           <w:szCs w:val="20"/>
-                          <w:u w:val="single"/>
                           <w14:textOutline w14:w="9525" w14:cap="rnd" w14:cmpd="sng" w14:algn="ctr">
                             <w14:noFill/>
                             <w14:prstDash w14:val="solid"/>
@@ -2397,7 +2381,6 @@
                           <w:color w:val="FFFFFF" w:themeColor="background1"/>
                           <w:sz w:val="20"/>
                           <w:szCs w:val="20"/>
-                          <w:u w:val="single"/>
                           <w14:textOutline w14:w="9525" w14:cap="rnd" w14:cmpd="sng" w14:algn="ctr">
                             <w14:noFill/>
                             <w14:prstDash w14:val="solid"/>
@@ -2413,7 +2396,6 @@
                           <w:color w:val="FFFFFF" w:themeColor="background1"/>
                           <w:sz w:val="20"/>
                           <w:szCs w:val="20"/>
-                          <w:u w:val="single"/>
                           <w14:textOutline w14:w="9525" w14:cap="rnd" w14:cmpd="sng" w14:algn="ctr">
                             <w14:noFill/>
                             <w14:prstDash w14:val="solid"/>
@@ -3828,11 +3810,375 @@
     <w:p/>
     <w:p>
       <w:pPr>
+        <w:spacing w:line="276" w:lineRule="auto"/>
+        <w:rPr>
+          <w:rFonts w:ascii="GT Eesti Pro Display Light" w:hAnsi="GT Eesti Pro Display Light"/>
+          <w:sz w:val="20"/>
+          <w:szCs w:val="20"/>
+          <w14:textOutline w14:w="9525" w14:cap="rnd" w14:cmpd="sng" w14:algn="ctr">
+            <w14:noFill/>
+            <w14:prstDash w14:val="solid"/>
+            <w14:bevel/>
+          </w14:textOutline>
+        </w:rPr>
+      </w:pPr>
+      <w:r>
+        <w:rPr>
+          <w:rFonts w:ascii="GT Eesti Pro Display Light" w:hAnsi="GT Eesti Pro Display Light"/>
+          <w:sz w:val="20"/>
+          <w:szCs w:val="20"/>
+          <w14:textOutline w14:w="9525" w14:cap="rnd" w14:cmpd="sng" w14:algn="ctr">
+            <w14:noFill/>
+            <w14:prstDash w14:val="solid"/>
+            <w14:bevel/>
+          </w14:textOutline>
+        </w:rPr>
+        <w:t xml:space="preserve">{%p for </w:t>
+      </w:r>
+      <w:r>
+        <w:rPr>
+          <w:rFonts w:ascii="GT Eesti Pro Display Light" w:hAnsi="GT Eesti Pro Display Light"/>
+          <w:sz w:val="20"/>
+          <w:szCs w:val="20"/>
+          <w14:textOutline w14:w="9525" w14:cap="rnd" w14:cmpd="sng" w14:algn="ctr">
+            <w14:noFill/>
+            <w14:prstDash w14:val="solid"/>
+            <w14:bevel/>
+          </w14:textOutline>
+        </w:rPr>
+        <w:t>d</w:t>
+      </w:r>
+      <w:r>
+        <w:rPr>
+          <w:rFonts w:ascii="GT Eesti Pro Display Light" w:hAnsi="GT Eesti Pro Display Light"/>
+          <w:sz w:val="20"/>
+          <w:szCs w:val="20"/>
+          <w14:textOutline w14:w="9525" w14:cap="rnd" w14:cmpd="sng" w14:algn="ctr">
+            <w14:noFill/>
+            <w14:prstDash w14:val="solid"/>
+            <w14:bevel/>
+          </w14:textOutline>
+        </w:rPr>
+        <w:t xml:space="preserve"> in </w:t>
+      </w:r>
+      <w:r>
+        <w:rPr>
+          <w:rFonts w:ascii="GT Eesti Pro Display Light" w:hAnsi="GT Eesti Pro Display Light"/>
+          <w:sz w:val="20"/>
+          <w:szCs w:val="20"/>
+          <w14:textOutline w14:w="9525" w14:cap="rnd" w14:cmpd="sng" w14:algn="ctr">
+            <w14:noFill/>
+            <w14:prstDash w14:val="solid"/>
+            <w14:bevel/>
+          </w14:textOutline>
+        </w:rPr>
+        <w:t>diplômes</w:t>
+      </w:r>
+      <w:r>
+        <w:rPr>
+          <w:rFonts w:ascii="GT Eesti Pro Display Light" w:hAnsi="GT Eesti Pro Display Light"/>
+          <w:sz w:val="20"/>
+          <w:szCs w:val="20"/>
+          <w14:textOutline w14:w="9525" w14:cap="rnd" w14:cmpd="sng" w14:algn="ctr">
+            <w14:noFill/>
+            <w14:prstDash w14:val="solid"/>
+            <w14:bevel/>
+          </w14:textOutline>
+        </w:rPr>
+        <w:t xml:space="preserve">%} </w:t>
+      </w:r>
+    </w:p>
+    <w:p>
+      <w:pPr>
+        <w:spacing w:line="276" w:lineRule="auto"/>
+        <w:rPr>
+          <w:rFonts w:ascii="GT Eesti Pro Display" w:hAnsi="GT Eesti Pro Display"/>
+          <w:color w:val="262626"/>
+          <w14:textFill>
+            <w14:gradFill>
+              <w14:gsLst>
+                <w14:gs w14:pos="29000">
+                  <w14:srgbClr w14:val="FF6D00"/>
+                </w14:gs>
+                <w14:gs w14:pos="100000">
+                  <w14:srgbClr w14:val="0BD0F7"/>
+                </w14:gs>
+              </w14:gsLst>
+              <w14:lin w14:ang="18000000" w14:scaled="0"/>
+            </w14:gradFill>
+          </w14:textFill>
+        </w:rPr>
+      </w:pPr>
+      <w:proofErr w:type="gramStart"/>
+      <w:r>
+        <w:rPr>
+          <w:rFonts w:ascii="GT Eesti Pro Display" w:hAnsi="GT Eesti Pro Display"/>
+          <w:color w:val="262626"/>
+          <w14:textFill>
+            <w14:gradFill>
+              <w14:gsLst>
+                <w14:gs w14:pos="29000">
+                  <w14:srgbClr w14:val="FF6D00"/>
+                </w14:gs>
+                <w14:gs w14:pos="100000">
+                  <w14:srgbClr w14:val="0BD0F7"/>
+                </w14:gs>
+              </w14:gsLst>
+              <w14:lin w14:ang="18000000" w14:scaled="0"/>
+            </w14:gradFill>
+          </w14:textFill>
+        </w:rPr>
+        <w:t xml:space="preserve">{{ </w:t>
+      </w:r>
+      <w:proofErr w:type="spellStart"/>
+      <w:r>
+        <w:rPr>
+          <w:rFonts w:ascii="GT Eesti Pro Display" w:hAnsi="GT Eesti Pro Display"/>
+          <w:color w:val="262626"/>
+          <w14:textFill>
+            <w14:gradFill>
+              <w14:gsLst>
+                <w14:gs w14:pos="29000">
+                  <w14:srgbClr w14:val="FF6D00"/>
+                </w14:gs>
+                <w14:gs w14:pos="100000">
+                  <w14:srgbClr w14:val="0BD0F7"/>
+                </w14:gs>
+              </w14:gsLst>
+              <w14:lin w14:ang="18000000" w14:scaled="0"/>
+            </w14:gradFill>
+          </w14:textFill>
+        </w:rPr>
+        <w:t>d</w:t>
+      </w:r>
+      <w:proofErr w:type="gramEnd"/>
+      <w:r>
+        <w:rPr>
+          <w:rFonts w:ascii="GT Eesti Pro Display" w:hAnsi="GT Eesti Pro Display"/>
+          <w:color w:val="262626"/>
+          <w14:textFill>
+            <w14:gradFill>
+              <w14:gsLst>
+                <w14:gs w14:pos="29000">
+                  <w14:srgbClr w14:val="FF6D00"/>
+                </w14:gs>
+                <w14:gs w14:pos="100000">
+                  <w14:srgbClr w14:val="0BD0F7"/>
+                </w14:gs>
+              </w14:gsLst>
+              <w14:lin w14:ang="18000000" w14:scaled="0"/>
+            </w14:gradFill>
+          </w14:textFill>
+        </w:rPr>
+        <w:t>.</w:t>
+      </w:r>
+      <w:proofErr w:type="gramStart"/>
+      <w:r>
+        <w:rPr>
+          <w:rFonts w:ascii="GT Eesti Pro Display" w:hAnsi="GT Eesti Pro Display"/>
+          <w:color w:val="262626"/>
+          <w14:textFill>
+            <w14:gradFill>
+              <w14:gsLst>
+                <w14:gs w14:pos="29000">
+                  <w14:srgbClr w14:val="FF6D00"/>
+                </w14:gs>
+                <w14:gs w14:pos="100000">
+                  <w14:srgbClr w14:val="0BD0F7"/>
+                </w14:gs>
+              </w14:gsLst>
+              <w14:lin w14:ang="18000000" w14:scaled="0"/>
+            </w14:gradFill>
+          </w14:textFill>
+        </w:rPr>
+        <w:t>intitule</w:t>
+      </w:r>
+      <w:proofErr w:type="spellEnd"/>
+      <w:r>
+        <w:rPr>
+          <w:rFonts w:ascii="GT Eesti Pro Display" w:hAnsi="GT Eesti Pro Display"/>
+          <w:color w:val="262626"/>
+          <w14:textFill>
+            <w14:gradFill>
+              <w14:gsLst>
+                <w14:gs w14:pos="29000">
+                  <w14:srgbClr w14:val="FF6D00"/>
+                </w14:gs>
+                <w14:gs w14:pos="100000">
+                  <w14:srgbClr w14:val="0BD0F7"/>
+                </w14:gs>
+              </w14:gsLst>
+              <w14:lin w14:ang="18000000" w14:scaled="0"/>
+            </w14:gradFill>
+          </w14:textFill>
+        </w:rPr>
+        <w:t xml:space="preserve"> }</w:t>
+      </w:r>
+      <w:proofErr w:type="gramEnd"/>
+      <w:r>
+        <w:rPr>
+          <w:rFonts w:ascii="GT Eesti Pro Display" w:hAnsi="GT Eesti Pro Display"/>
+          <w:color w:val="262626"/>
+          <w14:textFill>
+            <w14:gradFill>
+              <w14:gsLst>
+                <w14:gs w14:pos="29000">
+                  <w14:srgbClr w14:val="FF6D00"/>
+                </w14:gs>
+                <w14:gs w14:pos="100000">
+                  <w14:srgbClr w14:val="0BD0F7"/>
+                </w14:gs>
+              </w14:gsLst>
+              <w14:lin w14:ang="18000000" w14:scaled="0"/>
+            </w14:gradFill>
+          </w14:textFill>
+        </w:rPr>
+        <w:t>}</w:t>
+      </w:r>
+    </w:p>
+    <w:sdt>
+      <w:sdtPr>
+        <w:rPr>
+          <w:rFonts w:ascii="GT Eesti Pro Display" w:hAnsi="GT Eesti Pro Display"/>
+          <w:color w:val="262626"/>
+        </w:rPr>
+        <w:alias w:val="environnement_technique"/>
+        <w:tag w:val="environnement_technique"/>
+        <w:id w:val="-1410079435"/>
+        <w:placeholder>
+          <w:docPart w:val="70B6667C3E5EAB48BA7FAD89F22E7F7A"/>
+        </w:placeholder>
+        <w15:appearance w15:val="hidden"/>
+        <w:text w:multiLine="1"/>
+      </w:sdtPr>
+      <w:sdtContent>
+        <w:p>
+          <w:pPr>
+            <w:spacing w:after="0"/>
+            <w:rPr>
+              <w:rFonts w:ascii="GT Eesti Pro Display" w:hAnsi="GT Eesti Pro Display"/>
+              <w:color w:val="262626"/>
+            </w:rPr>
+          </w:pPr>
+          <w:r>
+            <w:rPr>
+              <w:rFonts w:ascii="GT Eesti Pro Display" w:hAnsi="GT Eesti Pro Display"/>
+              <w:color w:val="262626"/>
+            </w:rPr>
+            <w:t xml:space="preserve">{{ </w:t>
+          </w:r>
+          <w:proofErr w:type="spellStart"/>
+          <w:r>
+            <w:rPr>
+              <w:rFonts w:ascii="GT Eesti Pro Display" w:hAnsi="GT Eesti Pro Display"/>
+              <w:color w:val="262626"/>
+            </w:rPr>
+            <w:t>d.date</w:t>
+          </w:r>
+          <w:proofErr w:type="spellEnd"/>
+          <w:r>
+            <w:rPr>
+              <w:rFonts w:ascii="GT Eesti Pro Display" w:hAnsi="GT Eesti Pro Display"/>
+              <w:color w:val="262626"/>
+            </w:rPr>
+            <w:t xml:space="preserve"> }} | {{ </w:t>
+          </w:r>
+          <w:proofErr w:type="spellStart"/>
+          <w:r>
+            <w:rPr>
+              <w:rFonts w:ascii="GT Eesti Pro Display" w:hAnsi="GT Eesti Pro Display"/>
+              <w:color w:val="262626"/>
+            </w:rPr>
+            <w:t>d.</w:t>
+          </w:r>
+          <w:r>
+            <w:rPr>
+              <w:rFonts w:ascii="GT Eesti Pro Display" w:hAnsi="GT Eesti Pro Display"/>
+              <w:color w:val="262626"/>
+            </w:rPr>
+            <w:t>école</w:t>
+          </w:r>
+          <w:proofErr w:type="spellEnd"/>
+          <w:r>
+            <w:rPr>
+              <w:rFonts w:ascii="GT Eesti Pro Display" w:hAnsi="GT Eesti Pro Display"/>
+              <w:color w:val="262626"/>
+            </w:rPr>
+            <w:t xml:space="preserve"> }}</w:t>
+          </w:r>
+          <w:r>
+            <w:rPr>
+              <w:rFonts w:ascii="GT Eesti Pro Display" w:hAnsi="GT Eesti Pro Display"/>
+              <w:color w:val="262626"/>
+            </w:rPr>
+            <w:br/>
+            <w:t>-----------------------------------------</w:t>
+          </w:r>
+        </w:p>
+      </w:sdtContent>
+    </w:sdt>
+    <w:p>
+      <w:pPr>
+        <w:spacing w:line="276" w:lineRule="auto"/>
+        <w:rPr>
+          <w:rFonts w:ascii="GT Eesti Pro Display Light" w:hAnsi="GT Eesti Pro Display Light"/>
+          <w:sz w:val="20"/>
+          <w:szCs w:val="20"/>
+          <w14:textOutline w14:w="9525" w14:cap="rnd" w14:cmpd="sng" w14:algn="ctr">
+            <w14:noFill/>
+            <w14:prstDash w14:val="solid"/>
+            <w14:bevel/>
+          </w14:textOutline>
+        </w:rPr>
+      </w:pPr>
+      <w:r>
+        <w:rPr>
+          <w:rFonts w:ascii="GT Eesti Pro Display Light" w:hAnsi="GT Eesti Pro Display Light"/>
+          <w:sz w:val="20"/>
+          <w:szCs w:val="20"/>
+          <w14:textOutline w14:w="9525" w14:cap="rnd" w14:cmpd="sng" w14:algn="ctr">
+            <w14:noFill/>
+            <w14:prstDash w14:val="solid"/>
+            <w14:bevel/>
+          </w14:textOutline>
+        </w:rPr>
+        <w:t xml:space="preserve">{%p </w:t>
+      </w:r>
+      <w:proofErr w:type="spellStart"/>
+      <w:r>
+        <w:rPr>
+          <w:rFonts w:ascii="GT Eesti Pro Display Light" w:hAnsi="GT Eesti Pro Display Light"/>
+          <w:sz w:val="20"/>
+          <w:szCs w:val="20"/>
+          <w14:textOutline w14:w="9525" w14:cap="rnd" w14:cmpd="sng" w14:algn="ctr">
+            <w14:noFill/>
+            <w14:prstDash w14:val="solid"/>
+            <w14:bevel/>
+          </w14:textOutline>
+        </w:rPr>
+        <w:t>endfor</w:t>
+      </w:r>
+      <w:proofErr w:type="spellEnd"/>
+      <w:r>
+        <w:rPr>
+          <w:rFonts w:ascii="GT Eesti Pro Display Light" w:hAnsi="GT Eesti Pro Display Light"/>
+          <w:sz w:val="20"/>
+          <w:szCs w:val="20"/>
+          <w14:textOutline w14:w="9525" w14:cap="rnd" w14:cmpd="sng" w14:algn="ctr">
+            <w14:noFill/>
+            <w14:prstDash w14:val="solid"/>
+            <w14:bevel/>
+          </w14:textOutline>
+        </w:rPr>
+        <w:t xml:space="preserve"> %}</w:t>
+      </w:r>
+    </w:p>
+    <w:p>
+      <w:pPr>
         <w:spacing w:after="0"/>
         <w:ind w:firstLine="284"/>
         <w:rPr>
           <w:rFonts w:ascii="GT Eesti Pro Display Light" w:hAnsi="GT Eesti Pro Display Light"/>
-          <w:color w:val="262626"/>
           <w:lang w:val="en-US"/>
         </w:rPr>
       </w:pPr>
@@ -5301,6 +5647,35 @@
         </w:p>
       </w:docPartBody>
     </w:docPart>
+    <w:docPart>
+      <w:docPartPr>
+        <w:name w:val="70B6667C3E5EAB48BA7FAD89F22E7F7A"/>
+        <w:category>
+          <w:name w:val="Général"/>
+          <w:gallery w:val="placeholder"/>
+        </w:category>
+        <w:types>
+          <w:type w:val="bbPlcHdr"/>
+        </w:types>
+        <w:behaviors>
+          <w:behavior w:val="content"/>
+        </w:behaviors>
+        <w:guid w:val="{03A16493-F492-0648-8665-CAF6779994DA}"/>
+      </w:docPartPr>
+      <w:docPartBody>
+        <w:p>
+          <w:pPr>
+            <w:pStyle w:val="70B6667C3E5EAB48BA7FAD89F22E7F7A"/>
+          </w:pPr>
+          <w:r>
+            <w:rPr>
+              <w:rStyle w:val="Textedelespacerserv"/>
+            </w:rPr>
+            <w:t>Cliquez ou appuyez ici pour entrer du texte.</w:t>
+          </w:r>
+        </w:p>
+      </w:docPartBody>
+    </w:docPart>
   </w:docParts>
 </w:glossaryDocument>
 </file>
@@ -5338,11 +5713,10 @@
   <w:font w:name="GT Eesti Pro Display Light">
     <w:altName w:val="Calibri"/>
     <w:panose1 w:val="020B0604020202020204"/>
-    <w:charset w:val="4D"/>
+    <w:charset w:val="00"/>
     <w:family w:val="auto"/>
-    <w:notTrueType/>
     <w:pitch w:val="variable"/>
-    <w:sig w:usb0="A10002EF" w:usb1="5000A47B" w:usb2="00000000" w:usb3="00000000" w:csb0="00000097" w:csb1="00000000"/>
+    <w:sig w:usb0="00000207" w:usb1="00000000" w:usb2="00000000" w:usb3="00000000" w:csb0="00000097" w:csb1="00000000"/>
   </w:font>
   <w:font w:name="Calibri">
     <w:panose1 w:val="020F0502020204030204"/>
@@ -5361,11 +5735,10 @@
   <w:font w:name="GT Eesti Pro Display">
     <w:altName w:val="Calibri"/>
     <w:panose1 w:val="020B0604020202020204"/>
-    <w:charset w:val="4D"/>
+    <w:charset w:val="00"/>
     <w:family w:val="auto"/>
-    <w:notTrueType/>
     <w:pitch w:val="variable"/>
-    <w:sig w:usb0="A10002EF" w:usb1="5000A47B" w:usb2="00000000" w:usb3="00000000" w:csb0="00000097" w:csb1="00000000"/>
+    <w:sig w:usb0="00000207" w:usb1="00000000" w:usb2="00000000" w:usb3="00000000" w:csb0="00000097" w:csb1="00000000"/>
   </w:font>
   <w:font w:name="Cambria">
     <w:panose1 w:val="02040503050406030204"/>
@@ -5420,7 +5793,10 @@
     <w:rsid w:val="003A5AD5"/>
     <w:rsid w:val="004942E3"/>
     <w:rsid w:val="008C21B7"/>
+    <w:rsid w:val="009513F6"/>
+    <w:rsid w:val="00B33536"/>
     <w:rsid w:val="00C62E22"/>
+    <w:rsid w:val="00F45237"/>
   </w:rsids>
   <m:mathPr>
     <m:mathFont m:val="Cambria Math"/>
@@ -5876,7 +6252,7 @@
     <w:basedOn w:val="Policepardfaut"/>
     <w:uiPriority w:val="99"/>
     <w:semiHidden/>
-    <w:rsid w:val="002574BC"/>
+    <w:rsid w:val="009513F6"/>
     <w:rPr>
       <w:color w:val="666666"/>
     </w:rPr>
@@ -5896,6 +6272,10 @@
   <w:style w:type="paragraph" w:customStyle="1" w:styleId="0B585456809E754B85E23475DB1B5698">
     <w:name w:val="0B585456809E754B85E23475DB1B5698"/>
     <w:rsid w:val="002574BC"/>
+  </w:style>
+  <w:style w:type="paragraph" w:customStyle="1" w:styleId="70B6667C3E5EAB48BA7FAD89F22E7F7A">
+    <w:name w:val="70B6667C3E5EAB48BA7FAD89F22E7F7A"/>
+    <w:rsid w:val="009513F6"/>
   </w:style>
 </w:styles>
 </file>
@@ -6203,6 +6583,25 @@
 </file>
 
 <file path=customXml/item1.xml><?xml version="1.0" encoding="utf-8"?>
+<?mso-contentType ?>
+<FormTemplates xmlns="http://schemas.microsoft.com/sharepoint/v3/contenttype/forms">
+  <Display>DocumentLibraryForm</Display>
+  <Edit>DocumentLibraryForm</Edit>
+  <New>DocumentLibraryForm</New>
+</FormTemplates>
+</file>
+
+<file path=customXml/item2.xml><?xml version="1.0" encoding="utf-8"?>
+<p:properties xmlns:p="http://schemas.microsoft.com/office/2006/metadata/properties" xmlns:xsi="http://www.w3.org/2001/XMLSchema-instance" xmlns:pc="http://schemas.microsoft.com/office/infopath/2007/PartnerControls">
+  <documentManagement>
+    <lcf76f155ced4ddcb4097134ff3c332f xmlns="3b844827-4b4a-4834-98de-6f1efa74ba1c">
+      <Terms xmlns="http://schemas.microsoft.com/office/infopath/2007/PartnerControls"/>
+    </lcf76f155ced4ddcb4097134ff3c332f>
+  </documentManagement>
+</p:properties>
+</file>
+
+<file path=customXml/item3.xml><?xml version="1.0" encoding="utf-8"?>
 <ct:contentTypeSchema xmlns:ct="http://schemas.microsoft.com/office/2006/metadata/contentType" xmlns:ma="http://schemas.microsoft.com/office/2006/metadata/properties/metaAttributes" ct:_="" ma:_="" ma:contentTypeName="Document" ma:contentTypeID="0x0101006BB8B9E1535DDF4381A342663006B538" ma:contentTypeVersion="12" ma:contentTypeDescription="Crée un document." ma:contentTypeScope="" ma:versionID="2f4d8c133362e4dfbe297352e8200513">
   <xsd:schema xmlns:xsd="http://www.w3.org/2001/XMLSchema" xmlns:xs="http://www.w3.org/2001/XMLSchema" xmlns:p="http://schemas.microsoft.com/office/2006/metadata/properties" xmlns:ns2="3b844827-4b4a-4834-98de-6f1efa74ba1c" xmlns:ns3="e7dc9bee-6579-4b70-9cbe-37b994f3bc49" targetNamespace="http://schemas.microsoft.com/office/2006/metadata/properties" ma:root="true" ma:fieldsID="e891fc060288ec8b6b7ce63bc70e214d" ns2:_="" ns3:_="">
     <xsd:import namespace="3b844827-4b4a-4834-98de-6f1efa74ba1c"/>
@@ -6413,26 +6812,25 @@
 </ct:contentTypeSchema>
 </file>
 
-<file path=customXml/item2.xml><?xml version="1.0" encoding="utf-8"?>
-<p:properties xmlns:p="http://schemas.microsoft.com/office/2006/metadata/properties" xmlns:xsi="http://www.w3.org/2001/XMLSchema-instance" xmlns:pc="http://schemas.microsoft.com/office/infopath/2007/PartnerControls">
-  <documentManagement>
-    <lcf76f155ced4ddcb4097134ff3c332f xmlns="3b844827-4b4a-4834-98de-6f1efa74ba1c">
-      <Terms xmlns="http://schemas.microsoft.com/office/infopath/2007/PartnerControls"/>
-    </lcf76f155ced4ddcb4097134ff3c332f>
-  </documentManagement>
-</p:properties>
+<file path=customXml/itemProps1.xml><?xml version="1.0" encoding="utf-8"?>
+<ds:datastoreItem xmlns:ds="http://schemas.openxmlformats.org/officeDocument/2006/customXml" ds:itemID="{771FC7F0-0E1C-47B7-8864-E8F3FAEBD55B}">
+  <ds:schemaRefs>
+    <ds:schemaRef ds:uri="http://schemas.microsoft.com/sharepoint/v3/contenttype/forms"/>
+  </ds:schemaRefs>
+</ds:datastoreItem>
 </file>
 
-<file path=customXml/item3.xml><?xml version="1.0" encoding="utf-8"?>
-<?mso-contentType ?>
-<FormTemplates xmlns="http://schemas.microsoft.com/sharepoint/v3/contenttype/forms">
-  <Display>DocumentLibraryForm</Display>
-  <Edit>DocumentLibraryForm</Edit>
-  <New>DocumentLibraryForm</New>
-</FormTemplates>
+<file path=customXml/itemProps2.xml><?xml version="1.0" encoding="utf-8"?>
+<ds:datastoreItem xmlns:ds="http://schemas.openxmlformats.org/officeDocument/2006/customXml" ds:itemID="{8C81C113-4BE3-4B6F-977B-9CB23AF518F4}">
+  <ds:schemaRefs>
+    <ds:schemaRef ds:uri="http://schemas.microsoft.com/office/2006/metadata/properties"/>
+    <ds:schemaRef ds:uri="http://schemas.microsoft.com/office/infopath/2007/PartnerControls"/>
+    <ds:schemaRef ds:uri="3b844827-4b4a-4834-98de-6f1efa74ba1c"/>
+  </ds:schemaRefs>
+</ds:datastoreItem>
 </file>
 
-<file path=customXml/itemProps1.xml><?xml version="1.0" encoding="utf-8"?>
+<file path=customXml/itemProps3.xml><?xml version="1.0" encoding="utf-8"?>
 <ds:datastoreItem xmlns:ds="http://schemas.openxmlformats.org/officeDocument/2006/customXml" ds:itemID="{8354B819-E934-4976-8F86-5930D9D76B06}">
   <ds:schemaRefs>
     <ds:schemaRef ds:uri="http://schemas.microsoft.com/office/2006/metadata/contentType"/>
@@ -6449,22 +6847,4 @@
     <ds:schemaRef ds:uri="http://schemas.microsoft.com/internal/obd"/>
   </ds:schemaRefs>
 </ds:datastoreItem>
-</file>
-
-<file path=customXml/itemProps2.xml><?xml version="1.0" encoding="utf-8"?>
-<ds:datastoreItem xmlns:ds="http://schemas.openxmlformats.org/officeDocument/2006/customXml" ds:itemID="{8C81C113-4BE3-4B6F-977B-9CB23AF518F4}">
-  <ds:schemaRefs>
-    <ds:schemaRef ds:uri="http://schemas.microsoft.com/office/2006/metadata/properties"/>
-    <ds:schemaRef ds:uri="http://schemas.microsoft.com/office/infopath/2007/PartnerControls"/>
-    <ds:schemaRef ds:uri="3b844827-4b4a-4834-98de-6f1efa74ba1c"/>
-  </ds:schemaRefs>
-</ds:datastoreItem>
-</file>
-
-<file path=customXml/itemProps3.xml><?xml version="1.0" encoding="utf-8"?>
-<ds:datastoreItem xmlns:ds="http://schemas.openxmlformats.org/officeDocument/2006/customXml" ds:itemID="{771FC7F0-0E1C-47B7-8864-E8F3FAEBD55B}">
-  <ds:schemaRefs>
-    <ds:schemaRef ds:uri="http://schemas.microsoft.com/sharepoint/v3/contenttype/forms"/>
-  </ds:schemaRefs>
-</ds:datastoreItem>
 </file>
</xml_diff>